<commit_message>
Final updates for 2026
</commit_message>
<xml_diff>
--- a/Chap/RazorPages/RazorPagesRep.docx
+++ b/Chap/RazorPages/RazorPagesRep.docx
@@ -211,8 +211,6 @@
         </w:rPr>
         <w:t>9</w:t>
       </w:r>
-      <w:bookmarkStart w:id="0" w:name="_GoBack"/>
-      <w:bookmarkEnd w:id="0"/>
       <w:r>
         <w:rPr>
           <w:b/>
@@ -13498,6 +13496,16 @@
         </w:rPr>
         <w:t xml:space="preserve"> id)</w:t>
       </w:r>
+      <w:r>
+        <w:rPr>
+          <w:rFonts w:ascii="Cascadia Mono" w:hAnsi="Cascadia Mono" w:cs="Cascadia Mono"/>
+          <w:color w:val="000000"/>
+          <w:sz w:val="19"/>
+          <w:szCs w:val="19"/>
+          <w:lang w:val="en-US"/>
+        </w:rPr>
+        <w:t>;</w:t>
+      </w:r>
     </w:p>
     <w:p>
       <w:pPr>
@@ -14818,6 +14826,16 @@
           <w:lang w:val="en-US"/>
         </w:rPr>
         <w:t>Product</w:t>
+      </w:r>
+      <w:r>
+        <w:rPr>
+          <w:rFonts w:ascii="Cascadia Mono" w:hAnsi="Cascadia Mono" w:cs="Cascadia Mono"/>
+          <w:color w:val="2B91AF"/>
+          <w:sz w:val="19"/>
+          <w:szCs w:val="19"/>
+          <w:lang w:val="en-US"/>
+        </w:rPr>
+        <w:t>?</w:t>
       </w:r>
       <w:r>
         <w:rPr>
@@ -19301,32 +19319,22 @@
       <w:r>
         <w:rPr>
           <w:rFonts w:ascii="Cascadia Mono" w:hAnsi="Cascadia Mono" w:cs="Cascadia Mono"/>
-          <w:color w:val="0000FF"/>
-          <w:sz w:val="19"/>
-          <w:szCs w:val="19"/>
-          <w:lang w:val="en-US"/>
-        </w:rPr>
-        <w:t>virtual</w:t>
-      </w:r>
-      <w:r>
-        <w:rPr>
-          <w:rFonts w:ascii="Cascadia Mono" w:hAnsi="Cascadia Mono" w:cs="Cascadia Mono"/>
-          <w:color w:val="000000"/>
-          <w:sz w:val="19"/>
-          <w:szCs w:val="19"/>
-          <w:lang w:val="en-US"/>
-        </w:rPr>
-        <w:t xml:space="preserve"> </w:t>
-      </w:r>
-      <w:r>
-        <w:rPr>
-          <w:rFonts w:ascii="Cascadia Mono" w:hAnsi="Cascadia Mono" w:cs="Cascadia Mono"/>
           <w:color w:val="2B91AF"/>
           <w:sz w:val="19"/>
           <w:szCs w:val="19"/>
           <w:lang w:val="en-US"/>
         </w:rPr>
-        <w:t>IActionResult</w:t>
+        <w:t>IA</w:t>
+      </w:r>
+      <w:r>
+        <w:rPr>
+          <w:rFonts w:ascii="Cascadia Mono" w:hAnsi="Cascadia Mono" w:cs="Cascadia Mono"/>
+          <w:color w:val="2B91AF"/>
+          <w:sz w:val="19"/>
+          <w:szCs w:val="19"/>
+          <w:lang w:val="en-US"/>
+        </w:rPr>
+        <w:t>ctionResult</w:t>
       </w:r>
       <w:r>
         <w:rPr>
@@ -19421,6 +19429,16 @@
       <w:r>
         <w:rPr>
           <w:rFonts w:ascii="Cascadia Mono" w:hAnsi="Cascadia Mono" w:cs="Cascadia Mono"/>
+          <w:color w:val="2B91AF"/>
+          <w:sz w:val="19"/>
+          <w:szCs w:val="19"/>
+          <w:lang w:val="en-US"/>
+        </w:rPr>
+        <w:t>?</w:t>
+      </w:r>
+      <w:r>
+        <w:rPr>
+          <w:rFonts w:ascii="Cascadia Mono" w:hAnsi="Cascadia Mono" w:cs="Cascadia Mono"/>
           <w:color w:val="000000"/>
           <w:sz w:val="19"/>
           <w:szCs w:val="19"/>
@@ -19732,26 +19750,6 @@
           <w:lang w:val="en-US"/>
         </w:rPr>
         <w:t>public</w:t>
-      </w:r>
-      <w:r>
-        <w:rPr>
-          <w:rFonts w:ascii="Cascadia Mono" w:hAnsi="Cascadia Mono" w:cs="Cascadia Mono"/>
-          <w:color w:val="000000"/>
-          <w:sz w:val="19"/>
-          <w:szCs w:val="19"/>
-          <w:lang w:val="en-US"/>
-        </w:rPr>
-        <w:t xml:space="preserve"> </w:t>
-      </w:r>
-      <w:r>
-        <w:rPr>
-          <w:rFonts w:ascii="Cascadia Mono" w:hAnsi="Cascadia Mono" w:cs="Cascadia Mono"/>
-          <w:color w:val="0000FF"/>
-          <w:sz w:val="19"/>
-          <w:szCs w:val="19"/>
-          <w:lang w:val="en-US"/>
-        </w:rPr>
-        <w:t>virtual</w:t>
       </w:r>
       <w:r>
         <w:rPr>
@@ -24105,6 +24103,8 @@
         </w:rPr>
         <w:t xml:space="preserve"> </w:t>
       </w:r>
+      <w:bookmarkStart w:id="0" w:name="_GoBack"/>
+      <w:bookmarkEnd w:id="0"/>
     </w:p>
     <w:p>
       <w:pPr>
@@ -28278,7 +28278,7 @@
 </file>
 
 <file path=customXml/itemProps1.xml><?xml version="1.0" encoding="utf-8"?>
-<ds:datastoreItem xmlns:ds="http://schemas.openxmlformats.org/officeDocument/2006/customXml" ds:itemID="{95357D4E-9AD6-4D85-91E5-0A570440851A}">
+<ds:datastoreItem xmlns:ds="http://schemas.openxmlformats.org/officeDocument/2006/customXml" ds:itemID="{069FCB9F-F499-4B66-9BE5-E16C1B5EBB94}">
   <ds:schemaRefs>
     <ds:schemaRef ds:uri="http://schemas.openxmlformats.org/officeDocument/2006/bibliography"/>
   </ds:schemaRefs>

</xml_diff>